<commit_message>
Update character references from 小黑/Kuro to 默默/Momo throughout content
</commit_message>
<xml_diff>
--- a/momo_character_plan.docx
+++ b/momo_character_plan.docx
@@ -8,7 +8,7 @@
         <w:pStyle w:val="MdHeading1"/>
       </w:pPr>
       <w:r>
-        <w:t xml:space="preserve">虛擬人物企劃書：小黑 (Kuro)</w:t>
+        <w:t xml:space="preserve">虛擬人物企劃書：默默 (Momo)</w:t>
       </w:r>
     </w:p>
     <w:p>
@@ -33,7 +33,7 @@
         <w:t xml:space="preserve">名稱</w:t>
       </w:r>
       <w:r>
-        <w:t xml:space="preserve">：小黑 (Kuro)</w:t>
+        <w:t xml:space="preserve">：默默 (Momo)</w:t>
       </w:r>
     </w:p>
     <w:p>
@@ -100,10 +100,8 @@
       </w:r>
       <w:r>
         <w:t xml:space="preserve">：</w:t>
-      </w:r>
-      <w:r>
         <w:br/>
-        <w:t xml:space="preserve">小黑是一隻擁有光澤黑毛的日本豆柴，臉頰、眉毛上方及四肢內側帶有經典的「裏白」(Urajiro) 棕褐色斑紋。她的胸前有一塊獨特的白色毛髮，形狀如同繫著一條小領巾。小黑的眼睛明亮有神，總是透露出好奇與活潑的氣息，尾巴捲曲緊貼背部，展現豆柴的典型特徵。</w:t>
+        <w:t xml:space="preserve">默默是一隻擁有光澤黑毛的日本豆柴，臉頰、眉毛上方及四肢內側帶有經典的「裏白」(Urajiro) 棕褐色斑紋。她的胸前有一塊獨特的白色毛髮，形狀如同繫著一條小領巾。默默的眼睛明亮有神，總是透露出好奇與活潑的氣息，尾巴捲曲緊貼背部，展現豆柴的典型特徵。</w:t>
       </w:r>
     </w:p>
     <w:p>
@@ -126,10 +124,8 @@
       </w:r>
       <w:r>
         <w:t xml:space="preserve">：</w:t>
-      </w:r>
-      <w:r>
         <w:br/>
-        <w:t xml:space="preserve">小黑性格活潑開朗、好奇心旺盛，對周遭的一切都充滿探索欲。她熱愛戶外活動，特別喜歡散步和在草地上奔跑。偶爾會展現出一些小調皮的行為，但總能以她無辜又可愛的眼神化解一切。她喜歡與人互動，是個天生的社群明星。</w:t>
+        <w:t xml:space="preserve">默默性格活潑開朗、好奇心旺盛，對周遭的一切都充滿探索欲。她熱愛戶外活動，特別喜歡散步和在草地上奔跑。偶爾會展現出一些小調皮的行為，但總能以她無辜又可愛的眼神化解一切。她喜歡與人互動，是個天生的社群明星。</w:t>
       </w:r>
     </w:p>
     <w:p>
@@ -219,10 +215,8 @@
       </w:r>
       <w:r>
         <w:t xml:space="preserve">：</w:t>
-      </w:r>
-      <w:r>
         <w:br/>
-        <w:t xml:space="preserve">透過小黑的形象，建立一個充滿正能量、療癒且具有互動性的社群媒體帳號，吸引廣大愛狗人士及對生活充滿熱情的受眾。主要客群鎖定20-35歲女性，並逐步擴展至其他年齡層。</w:t>
+        <w:t xml:space="preserve">透過默默的形象，建立一個充滿正能量、療癒且具有互動性的社群媒體帳號，吸引廣大愛狗人士及對生活充滿熱情的受眾。主要客群鎖定20-35歲女性，並逐步擴展至其他年齡層。</w:t>
       </w:r>
     </w:p>
     <w:p>
@@ -245,8 +239,6 @@
       </w:r>
       <w:r>
         <w:t xml:space="preserve">：</w:t>
-      </w:r>
-      <w:r>
         <w:br/>
         <w:t xml:space="preserve">Instagram、Facebook、TikTok (視內容形式而定)</w:t>
       </w:r>
@@ -290,7 +282,7 @@
         <w:t xml:space="preserve">日常生活點滴</w:t>
       </w:r>
       <w:r>
-        <w:t xml:space="preserve">：分享小黑的日常趣事、搞怪行為、可愛睡姿等，展現其活潑、真實的一面。</w:t>
+        <w:t xml:space="preserve">：分享默默的日常趣事、搞怪行為、可愛睡姿等，展現其活潑、真實的一面。</w:t>
       </w:r>
     </w:p>
     <w:p>
@@ -310,7 +302,7 @@
         <w:t xml:space="preserve">戶外探險</w:t>
       </w:r>
       <w:r>
-        <w:t xml:space="preserve">：記錄小黑在公園、郊外、海邊等地的探險過程，搭配美麗的風景照或短影片，強調其愛冒險的個性。</w:t>
+        <w:t xml:space="preserve">：記錄默默在公園、郊外、海邊等地的探險過程，搭配美麗的風景照或短影片，強調其愛冒險的個性。</w:t>
       </w:r>
     </w:p>
     <w:p>
@@ -330,7 +322,7 @@
         <w:t xml:space="preserve">美食分享</w:t>
       </w:r>
       <w:r>
-        <w:t xml:space="preserve">：分享小黑品嚐零食或健康鮮食的可愛反應，可結合寵物食品推薦或自製食譜。</w:t>
+        <w:t xml:space="preserve">：分享默默品嚐零食或健康鮮食的可愛反應，可結合寵物食品推薦或自製食譜。</w:t>
       </w:r>
     </w:p>
     <w:p>
@@ -350,7 +342,7 @@
         <w:t xml:space="preserve">互動挑戰</w:t>
       </w:r>
       <w:r>
-        <w:t xml:space="preserve">：發起與粉絲互動的挑戰，例如「模仿小黑表情包」、「分享你家毛孩的趣事」等，增加粉絲參與度。</w:t>
+        <w:t xml:space="preserve">：發起與粉絲互動的挑戰，例如「模仿默默表情包」、「分享你家毛孩的趣事」等，增加粉絲參與度。</w:t>
       </w:r>
     </w:p>
     <w:p>
@@ -412,7 +404,7 @@
         <w:t xml:space="preserve">圖片</w:t>
       </w:r>
       <w:r>
-        <w:t xml:space="preserve">：以高品質、寫實風格的圖片為主，捕捉小黑活潑、多互動感的動作。圖片尺寸將針對社群媒體發布進行調整（例如Instagram貼文使用3:4比例）。</w:t>
+        <w:t xml:space="preserve">：以高品質、寫實風格的圖片為主，捕捉默默活潑、多互動感的動作。圖片尺寸將針對社群媒體發布進行調整（例如Instagram貼文使用3:4比例）。</w:t>
       </w:r>
     </w:p>
     <w:p>
@@ -432,7 +424,7 @@
         <w:t xml:space="preserve">短影片</w:t>
       </w:r>
       <w:r>
-        <w:t xml:space="preserve">：製作15-60秒的短影片，記錄小黑的動態瞬間，搭配輕快音樂和簡潔字幕。</w:t>
+        <w:t xml:space="preserve">：製作15-60秒的短影片，記錄默默的動態瞬間，搭配輕快音樂和簡潔字幕。</w:t>
       </w:r>
     </w:p>
     <w:p>
@@ -475,10 +467,8 @@
       </w:r>
       <w:r>
         <w:t xml:space="preserve">：</w:t>
-      </w:r>
-      <w:r>
         <w:br/>
-        <w:t xml:space="preserve">整體視覺風格應明亮、溫暖，色調柔和。圖片構圖注重黃金比例，突出小黑的可愛與活力。識別文字（若有）將放置在圖片的右下緣，保持整體美觀。</w:t>
+        <w:t xml:space="preserve">整體視覺風格應明亮、溫暖，色調柔和。圖片構圖注重黃金比例，突出默默的可愛與活力。識別文字（若有）將放置在圖片的右下緣，保持整體美觀。</w:t>
       </w:r>
     </w:p>
     <w:p>
@@ -559,7 +549,7 @@
         <w:pStyle w:val="MdParagraph"/>
       </w:pPr>
       <w:r>
-        <w:t xml:space="preserve">以下是為小黑生成的兩張寫實風格形象圖，展現了她活潑可愛的特質：</w:t>
+        <w:t xml:space="preserve">以下是為默默生成的兩張寫實風格形象圖，展現了她活潑可愛的特質：</w:t>
       </w:r>
     </w:p>
     <w:p>
@@ -585,7 +575,7 @@
         <w:t xml:space="preserve">形象圖 1</w:t>
       </w:r>
       <w:r>
-        <w:t xml:space="preserve">：小黑的特寫肖像，眼神明亮，背景為陽光下的公園與櫻花，營造溫馨氛圍。</w:t>
+        <w:t xml:space="preserve">：默默的特寫肖像，眼神明亮，背景為陽光下的公園與櫻花，營造溫馨氛圍。</w:t>
       </w:r>
     </w:p>
     <w:p>
@@ -605,7 +595,7 @@
         <w:t xml:space="preserve">形象圖 2</w:t>
       </w:r>
       <w:r>
-        <w:t xml:space="preserve">：小黑在草地上奔跑的全身照，動感十足，展現其愛玩的一面，並佩戴紅色時尚領巾。</w:t>
+        <w:t xml:space="preserve">：默默在草地上奔跑的全身照，動感十足，展現其愛玩的一面，並佩戴紅色時尚領巾。</w:t>
       </w:r>
     </w:p>
     <w:p>
@@ -628,7 +618,7 @@
         <w:pStyle w:val="MdParagraph"/>
       </w:pPr>
       <w:r>
-        <w:t xml:space="preserve">小黑作為一個具有鮮明個性和可愛外觀的虛擬人物，在社群媒體上具有巨大的潛力。未來可考慮發展周邊商品、參與公益活動、甚至成為品牌代言人，將其影響力從線上延伸至線下，創造更多價值。</w:t>
+        <w:t xml:space="preserve">默默作為一個具有鮮明個性和可愛外觀的虛擬人物，在社群媒體上具有巨大的潛力。未來可考慮發展周邊商品、參與公益活動、甚至成為品牌代言人，將其影響力從線上延伸至線下，創造更多價值。</w:t>
       </w:r>
     </w:p>
     <w:sectPr>

</xml_diff>